<commit_message>
content: add programme structure + example weekly timetable to the LB+ guides
Coordinators and educators had the per-component cadence and the 12-week
assessment arc, but no view of how the components fit together day to day. Add:
- Coordinator guide: a "programme structure" table (the three ~50h taught
  components + ongoing mentoring, running side by side ~150h total) and an
  example six-day week showing where each component and mentoring sit.
- Educator guide: a "what a week looks like" example week, with the note that
  independent hours are the between-session tasks done at home.

Both note how to adapt (fewer days -> longer sessions) and the reduced early-
cohort week (Agency in Learning + English) before the Research Project's shared
challenge is agreed.

Co-Authored-By: Claude Opus 4.8 <noreply@anthropic.com>
</commit_message>
<xml_diff>
--- a/public/downloads/lb-coxs-bazar-coordinator-guide.docx
+++ b/public/downloads/lb-coxs-bazar-coordinator-guide.docx
@@ -567,7 +567,7 @@
           <w:sz w:val="30"/>
           <w:szCs w:val="30"/>
         </w:rPr>
-        <w:t xml:space="preserve">4. The 12-week rhythm</w:t>
+        <w:t xml:space="preserve">4. The programme structure and the 12-week rhythm</w:t>
       </w:r>
     </w:p>
     <w:p>
@@ -579,7 +579,697 @@
           <w:sz w:val="22"/>
           <w:szCs w:val="22"/>
         </w:rPr>
-        <w:t xml:space="preserve">Each component runs at a cadence of 3 hours in-person plus 2 hours independent per week, across a minimum of 10 weeks of learning. Around that learning, hold this assessment rhythm: five weeks of learning, a supported assessment, five more weeks, then the final assessment. Your job is to protect the two assessment windows and keep them on the calendar.</w:t>
+        <w:t xml:space="preserve">The programme has three taught components plus ongoing mentoring, running side by side across the same weeks.</w:t>
+      </w:r>
+    </w:p>
+    <w:tbl>
+      <w:tblPr>
+        <w:tblW w:type="pct" w:w="100%"/>
+        <w:tblBorders>
+          <w:top w:val="single" w:color="auto" w:sz="4"/>
+          <w:left w:val="single" w:color="auto" w:sz="4"/>
+          <w:bottom w:val="single" w:color="auto" w:sz="4"/>
+          <w:right w:val="single" w:color="auto" w:sz="4"/>
+          <w:insideH w:val="single" w:color="auto" w:sz="4"/>
+          <w:insideV w:val="single" w:color="auto" w:sz="4"/>
+        </w:tblBorders>
+      </w:tblPr>
+      <w:tblGrid>
+        <w:gridCol w:w="3200"/>
+        <w:gridCol w:w="7600"/>
+      </w:tblGrid>
+      <w:tr>
+        <w:trPr>
+          <w:tblHeader/>
+        </w:trPr>
+        <w:tc>
+          <w:tcPr>
+            <w:tcW w:type="dxa" w:w="3200"/>
+            <w:shd w:fill="F0ECE3"/>
+            <w:tcMar>
+              <w:top w:type="dxa" w:w="60"/>
+              <w:left w:type="dxa" w:w="120"/>
+              <w:bottom w:type="dxa" w:w="60"/>
+              <w:right w:type="dxa" w:w="120"/>
+            </w:tcMar>
+          </w:tcPr>
+          <w:p>
+            <w:r>
+              <w:rPr>
+                <w:b/>
+                <w:bCs/>
+                <w:color w:val="1F3A5F"/>
+                <w:sz w:val="20"/>
+                <w:szCs w:val="20"/>
+              </w:rPr>
+              <w:t xml:space="preserve">Component</w:t>
+            </w:r>
+          </w:p>
+        </w:tc>
+        <w:tc>
+          <w:tcPr>
+            <w:tcW w:type="dxa" w:w="7600"/>
+            <w:shd w:fill="F0ECE3"/>
+            <w:tcMar>
+              <w:top w:type="dxa" w:w="60"/>
+              <w:left w:type="dxa" w:w="120"/>
+              <w:bottom w:type="dxa" w:w="60"/>
+              <w:right w:type="dxa" w:w="120"/>
+            </w:tcMar>
+          </w:tcPr>
+          <w:p>
+            <w:r>
+              <w:rPr>
+                <w:b/>
+                <w:bCs/>
+                <w:color w:val="1F3A5F"/>
+                <w:sz w:val="20"/>
+                <w:szCs w:val="20"/>
+              </w:rPr>
+              <w:t xml:space="preserve">Hours and cadence</w:t>
+            </w:r>
+          </w:p>
+        </w:tc>
+      </w:tr>
+      <w:tr>
+        <w:tc>
+          <w:tcPr>
+            <w:tcW w:type="dxa" w:w="3200"/>
+            <w:tcMar>
+              <w:top w:type="dxa" w:w="60"/>
+              <w:left w:type="dxa" w:w="120"/>
+              <w:bottom w:type="dxa" w:w="60"/>
+              <w:right w:type="dxa" w:w="120"/>
+            </w:tcMar>
+          </w:tcPr>
+          <w:p>
+            <w:r>
+              <w:rPr>
+                <w:b/>
+                <w:bCs/>
+                <w:color w:val="7A3B69"/>
+                <w:sz w:val="20"/>
+                <w:szCs w:val="20"/>
+              </w:rPr>
+              <w:t xml:space="preserve">Agency in Learning</w:t>
+            </w:r>
+          </w:p>
+        </w:tc>
+        <w:tc>
+          <w:tcPr>
+            <w:tcW w:type="dxa" w:w="7600"/>
+            <w:tcMar>
+              <w:top w:type="dxa" w:w="60"/>
+              <w:left w:type="dxa" w:w="120"/>
+              <w:bottom w:type="dxa" w:w="60"/>
+              <w:right w:type="dxa" w:w="120"/>
+            </w:tcMar>
+          </w:tcPr>
+          <w:p>
+            <w:r>
+              <w:rPr>
+                <w:b w:val="false"/>
+                <w:bCs w:val="false"/>
+                <w:sz w:val="20"/>
+                <w:szCs w:val="20"/>
+              </w:rPr>
+              <w:t xml:space="preserve">About 50 hours · 3h in-person + 2h independent per week. Develops Set and Pursue Goals (assessed).</w:t>
+            </w:r>
+          </w:p>
+        </w:tc>
+      </w:tr>
+      <w:tr>
+        <w:tc>
+          <w:tcPr>
+            <w:tcW w:type="dxa" w:w="3200"/>
+            <w:tcMar>
+              <w:top w:type="dxa" w:w="60"/>
+              <w:left w:type="dxa" w:w="120"/>
+              <w:bottom w:type="dxa" w:w="60"/>
+              <w:right w:type="dxa" w:w="120"/>
+            </w:tcMar>
+          </w:tcPr>
+          <w:p>
+            <w:r>
+              <w:rPr>
+                <w:b/>
+                <w:bCs/>
+                <w:color w:val="7A3B69"/>
+                <w:sz w:val="20"/>
+                <w:szCs w:val="20"/>
+              </w:rPr>
+              <w:t xml:space="preserve">Research Project</w:t>
+            </w:r>
+          </w:p>
+        </w:tc>
+        <w:tc>
+          <w:tcPr>
+            <w:tcW w:type="dxa" w:w="7600"/>
+            <w:tcMar>
+              <w:top w:type="dxa" w:w="60"/>
+              <w:left w:type="dxa" w:w="120"/>
+              <w:bottom w:type="dxa" w:w="60"/>
+              <w:right w:type="dxa" w:w="120"/>
+            </w:tcMar>
+          </w:tcPr>
+          <w:p>
+            <w:r>
+              <w:rPr>
+                <w:b w:val="false"/>
+                <w:bCs w:val="false"/>
+                <w:sz w:val="20"/>
+                <w:szCs w:val="20"/>
+              </w:rPr>
+              <w:t xml:space="preserve">About 50 hours · 3h in-person + 2h independent per week. Develops Investigate Real World Issues (assessed).</w:t>
+            </w:r>
+          </w:p>
+        </w:tc>
+      </w:tr>
+      <w:tr>
+        <w:tc>
+          <w:tcPr>
+            <w:tcW w:type="dxa" w:w="3200"/>
+            <w:tcMar>
+              <w:top w:type="dxa" w:w="60"/>
+              <w:left w:type="dxa" w:w="120"/>
+              <w:bottom w:type="dxa" w:w="60"/>
+              <w:right w:type="dxa" w:w="120"/>
+            </w:tcMar>
+          </w:tcPr>
+          <w:p>
+            <w:r>
+              <w:rPr>
+                <w:b/>
+                <w:bCs/>
+                <w:color w:val="7A3B69"/>
+                <w:sz w:val="20"/>
+                <w:szCs w:val="20"/>
+              </w:rPr>
+              <w:t xml:space="preserve">English Language Development</w:t>
+            </w:r>
+          </w:p>
+        </w:tc>
+        <w:tc>
+          <w:tcPr>
+            <w:tcW w:type="dxa" w:w="7600"/>
+            <w:tcMar>
+              <w:top w:type="dxa" w:w="60"/>
+              <w:left w:type="dxa" w:w="120"/>
+              <w:bottom w:type="dxa" w:w="60"/>
+              <w:right w:type="dxa" w:w="120"/>
+            </w:tcMar>
+          </w:tcPr>
+          <w:p>
+            <w:r>
+              <w:rPr>
+                <w:b w:val="false"/>
+                <w:bCs w:val="false"/>
+                <w:sz w:val="20"/>
+                <w:szCs w:val="20"/>
+              </w:rPr>
+              <w:t xml:space="preserve">About 50 hours · 3h in-person + 2h independent per week. Compulsory in this edition; assessed formatively against A1 Can-Do outcomes, not one of the two graded competencies.</w:t>
+            </w:r>
+          </w:p>
+        </w:tc>
+      </w:tr>
+      <w:tr>
+        <w:tc>
+          <w:tcPr>
+            <w:tcW w:type="dxa" w:w="3200"/>
+            <w:tcMar>
+              <w:top w:type="dxa" w:w="60"/>
+              <w:left w:type="dxa" w:w="120"/>
+              <w:bottom w:type="dxa" w:w="60"/>
+              <w:right w:type="dxa" w:w="120"/>
+            </w:tcMar>
+          </w:tcPr>
+          <w:p>
+            <w:r>
+              <w:rPr>
+                <w:b/>
+                <w:bCs/>
+                <w:color w:val="7A3B69"/>
+                <w:sz w:val="20"/>
+                <w:szCs w:val="20"/>
+              </w:rPr>
+              <w:t xml:space="preserve">Mentoring and Wellbeing</w:t>
+            </w:r>
+          </w:p>
+        </w:tc>
+        <w:tc>
+          <w:tcPr>
+            <w:tcW w:type="dxa" w:w="7600"/>
+            <w:tcMar>
+              <w:top w:type="dxa" w:w="60"/>
+              <w:left w:type="dxa" w:w="120"/>
+              <w:bottom w:type="dxa" w:w="60"/>
+              <w:right w:type="dxa" w:w="120"/>
+            </w:tcMar>
+          </w:tcPr>
+          <w:p>
+            <w:r>
+              <w:rPr>
+                <w:b w:val="false"/>
+                <w:bCs w:val="false"/>
+                <w:sz w:val="20"/>
+                <w:szCs w:val="20"/>
+              </w:rPr>
+              <w:t xml:space="preserve">Ongoing · short 1:1 or small-group conversations folded into the weekly in-person time. Not a fixed block of hours.</w:t>
+            </w:r>
+          </w:p>
+        </w:tc>
+      </w:tr>
+    </w:tbl>
+    <w:p>
+      <w:pPr>
+        <w:spacing w:after="120" w:before="0"/>
+      </w:pPr>
+      <w:r>
+        <w:rPr>
+          <w:sz w:val="22"/>
+          <w:szCs w:val="22"/>
+        </w:rPr>
+        <w:t xml:space="preserve">All three taught components run side by side across the same 10–12 weeks. At 3 hours in-person and 2 hours independent each, a full week is about 9 hours in-person and 6 hours of independent tasks (done at home between sessions), with mentoring folded into the in-person time — around 150 hours of taught learning in total.</w:t>
+      </w:r>
+    </w:p>
+    <w:p>
+      <w:pPr>
+        <w:pStyle w:val="Heading2"/>
+        <w:spacing w:after="80" w:before="200"/>
+      </w:pPr>
+      <w:r>
+        <w:rPr>
+          <w:b/>
+          <w:bCs/>
+          <w:color w:val="7A3B69"/>
+          <w:sz w:val="25"/>
+          <w:szCs w:val="25"/>
+        </w:rPr>
+        <w:t xml:space="preserve">An example week</w:t>
+      </w:r>
+    </w:p>
+    <w:p>
+      <w:pPr>
+        <w:spacing w:after="120" w:before="0"/>
+      </w:pPr>
+      <w:r>
+        <w:rPr>
+          <w:sz w:val="22"/>
+          <w:szCs w:val="22"/>
+        </w:rPr>
+        <w:t xml:space="preserve">One way to place the hours across a six-day week. Each in-person session is about an hour, mentoring is folded in, and the independent tasks are done at home between sessions.</w:t>
+      </w:r>
+    </w:p>
+    <w:tbl>
+      <w:tblPr>
+        <w:tblW w:type="pct" w:w="100%"/>
+        <w:tblBorders>
+          <w:top w:val="single" w:color="auto" w:sz="4"/>
+          <w:left w:val="single" w:color="auto" w:sz="4"/>
+          <w:bottom w:val="single" w:color="auto" w:sz="4"/>
+          <w:right w:val="single" w:color="auto" w:sz="4"/>
+          <w:insideH w:val="single" w:color="auto" w:sz="4"/>
+          <w:insideV w:val="single" w:color="auto" w:sz="4"/>
+        </w:tblBorders>
+      </w:tblPr>
+      <w:tblGrid>
+        <w:gridCol w:w="3200"/>
+        <w:gridCol w:w="7600"/>
+      </w:tblGrid>
+      <w:tr>
+        <w:trPr>
+          <w:tblHeader/>
+        </w:trPr>
+        <w:tc>
+          <w:tcPr>
+            <w:tcW w:type="dxa" w:w="3200"/>
+            <w:shd w:fill="F0ECE3"/>
+            <w:tcMar>
+              <w:top w:type="dxa" w:w="60"/>
+              <w:left w:type="dxa" w:w="120"/>
+              <w:bottom w:type="dxa" w:w="60"/>
+              <w:right w:type="dxa" w:w="120"/>
+            </w:tcMar>
+          </w:tcPr>
+          <w:p>
+            <w:r>
+              <w:rPr>
+                <w:b/>
+                <w:bCs/>
+                <w:color w:val="1F3A5F"/>
+                <w:sz w:val="20"/>
+                <w:szCs w:val="20"/>
+              </w:rPr>
+              <w:t xml:space="preserve">Day</w:t>
+            </w:r>
+          </w:p>
+        </w:tc>
+        <w:tc>
+          <w:tcPr>
+            <w:tcW w:type="dxa" w:w="7600"/>
+            <w:shd w:fill="F0ECE3"/>
+            <w:tcMar>
+              <w:top w:type="dxa" w:w="60"/>
+              <w:left w:type="dxa" w:w="120"/>
+              <w:bottom w:type="dxa" w:w="60"/>
+              <w:right w:type="dxa" w:w="120"/>
+            </w:tcMar>
+          </w:tcPr>
+          <w:p>
+            <w:r>
+              <w:rPr>
+                <w:b/>
+                <w:bCs/>
+                <w:color w:val="1F3A5F"/>
+                <w:sz w:val="20"/>
+                <w:szCs w:val="20"/>
+              </w:rPr>
+              <w:t xml:space="preserve">In-person sessions (about 1 hour each)</w:t>
+            </w:r>
+          </w:p>
+        </w:tc>
+      </w:tr>
+      <w:tr>
+        <w:tc>
+          <w:tcPr>
+            <w:tcW w:type="dxa" w:w="3200"/>
+            <w:tcMar>
+              <w:top w:type="dxa" w:w="60"/>
+              <w:left w:type="dxa" w:w="120"/>
+              <w:bottom w:type="dxa" w:w="60"/>
+              <w:right w:type="dxa" w:w="120"/>
+            </w:tcMar>
+          </w:tcPr>
+          <w:p>
+            <w:r>
+              <w:rPr>
+                <w:b/>
+                <w:bCs/>
+                <w:color w:val="7A3B69"/>
+                <w:sz w:val="20"/>
+                <w:szCs w:val="20"/>
+              </w:rPr>
+              <w:t xml:space="preserve">Day 1</w:t>
+            </w:r>
+          </w:p>
+        </w:tc>
+        <w:tc>
+          <w:tcPr>
+            <w:tcW w:type="dxa" w:w="7600"/>
+            <w:tcMar>
+              <w:top w:type="dxa" w:w="60"/>
+              <w:left w:type="dxa" w:w="120"/>
+              <w:bottom w:type="dxa" w:w="60"/>
+              <w:right w:type="dxa" w:w="120"/>
+            </w:tcMar>
+          </w:tcPr>
+          <w:p>
+            <w:r>
+              <w:rPr>
+                <w:b w:val="false"/>
+                <w:bCs w:val="false"/>
+                <w:sz w:val="20"/>
+                <w:szCs w:val="20"/>
+              </w:rPr>
+              <w:t xml:space="preserve">English  ·  Agency in Learning</w:t>
+            </w:r>
+          </w:p>
+        </w:tc>
+      </w:tr>
+      <w:tr>
+        <w:tc>
+          <w:tcPr>
+            <w:tcW w:type="dxa" w:w="3200"/>
+            <w:tcMar>
+              <w:top w:type="dxa" w:w="60"/>
+              <w:left w:type="dxa" w:w="120"/>
+              <w:bottom w:type="dxa" w:w="60"/>
+              <w:right w:type="dxa" w:w="120"/>
+            </w:tcMar>
+          </w:tcPr>
+          <w:p>
+            <w:r>
+              <w:rPr>
+                <w:b/>
+                <w:bCs/>
+                <w:color w:val="7A3B69"/>
+                <w:sz w:val="20"/>
+                <w:szCs w:val="20"/>
+              </w:rPr>
+              <w:t xml:space="preserve">Day 2</w:t>
+            </w:r>
+          </w:p>
+        </w:tc>
+        <w:tc>
+          <w:tcPr>
+            <w:tcW w:type="dxa" w:w="7600"/>
+            <w:tcMar>
+              <w:top w:type="dxa" w:w="60"/>
+              <w:left w:type="dxa" w:w="120"/>
+              <w:bottom w:type="dxa" w:w="60"/>
+              <w:right w:type="dxa" w:w="120"/>
+            </w:tcMar>
+          </w:tcPr>
+          <w:p>
+            <w:r>
+              <w:rPr>
+                <w:b w:val="false"/>
+                <w:bCs w:val="false"/>
+                <w:sz w:val="20"/>
+                <w:szCs w:val="20"/>
+              </w:rPr>
+              <w:t xml:space="preserve">Research Project  ·  mentoring check-ins</w:t>
+            </w:r>
+          </w:p>
+        </w:tc>
+      </w:tr>
+      <w:tr>
+        <w:tc>
+          <w:tcPr>
+            <w:tcW w:type="dxa" w:w="3200"/>
+            <w:tcMar>
+              <w:top w:type="dxa" w:w="60"/>
+              <w:left w:type="dxa" w:w="120"/>
+              <w:bottom w:type="dxa" w:w="60"/>
+              <w:right w:type="dxa" w:w="120"/>
+            </w:tcMar>
+          </w:tcPr>
+          <w:p>
+            <w:r>
+              <w:rPr>
+                <w:b/>
+                <w:bCs/>
+                <w:color w:val="7A3B69"/>
+                <w:sz w:val="20"/>
+                <w:szCs w:val="20"/>
+              </w:rPr>
+              <w:t xml:space="preserve">Day 3</w:t>
+            </w:r>
+          </w:p>
+        </w:tc>
+        <w:tc>
+          <w:tcPr>
+            <w:tcW w:type="dxa" w:w="7600"/>
+            <w:tcMar>
+              <w:top w:type="dxa" w:w="60"/>
+              <w:left w:type="dxa" w:w="120"/>
+              <w:bottom w:type="dxa" w:w="60"/>
+              <w:right w:type="dxa" w:w="120"/>
+            </w:tcMar>
+          </w:tcPr>
+          <w:p>
+            <w:r>
+              <w:rPr>
+                <w:b w:val="false"/>
+                <w:bCs w:val="false"/>
+                <w:sz w:val="20"/>
+                <w:szCs w:val="20"/>
+              </w:rPr>
+              <w:t xml:space="preserve">English  ·  Agency in Learning</w:t>
+            </w:r>
+          </w:p>
+        </w:tc>
+      </w:tr>
+      <w:tr>
+        <w:tc>
+          <w:tcPr>
+            <w:tcW w:type="dxa" w:w="3200"/>
+            <w:tcMar>
+              <w:top w:type="dxa" w:w="60"/>
+              <w:left w:type="dxa" w:w="120"/>
+              <w:bottom w:type="dxa" w:w="60"/>
+              <w:right w:type="dxa" w:w="120"/>
+            </w:tcMar>
+          </w:tcPr>
+          <w:p>
+            <w:r>
+              <w:rPr>
+                <w:b/>
+                <w:bCs/>
+                <w:color w:val="7A3B69"/>
+                <w:sz w:val="20"/>
+                <w:szCs w:val="20"/>
+              </w:rPr>
+              <w:t xml:space="preserve">Day 4</w:t>
+            </w:r>
+          </w:p>
+        </w:tc>
+        <w:tc>
+          <w:tcPr>
+            <w:tcW w:type="dxa" w:w="7600"/>
+            <w:tcMar>
+              <w:top w:type="dxa" w:w="60"/>
+              <w:left w:type="dxa" w:w="120"/>
+              <w:bottom w:type="dxa" w:w="60"/>
+              <w:right w:type="dxa" w:w="120"/>
+            </w:tcMar>
+          </w:tcPr>
+          <w:p>
+            <w:r>
+              <w:rPr>
+                <w:b w:val="false"/>
+                <w:bCs w:val="false"/>
+                <w:sz w:val="20"/>
+                <w:szCs w:val="20"/>
+              </w:rPr>
+              <w:t xml:space="preserve">Research Project  ·  mentoring check-ins</w:t>
+            </w:r>
+          </w:p>
+        </w:tc>
+      </w:tr>
+      <w:tr>
+        <w:tc>
+          <w:tcPr>
+            <w:tcW w:type="dxa" w:w="3200"/>
+            <w:tcMar>
+              <w:top w:type="dxa" w:w="60"/>
+              <w:left w:type="dxa" w:w="120"/>
+              <w:bottom w:type="dxa" w:w="60"/>
+              <w:right w:type="dxa" w:w="120"/>
+            </w:tcMar>
+          </w:tcPr>
+          <w:p>
+            <w:r>
+              <w:rPr>
+                <w:b/>
+                <w:bCs/>
+                <w:color w:val="7A3B69"/>
+                <w:sz w:val="20"/>
+                <w:szCs w:val="20"/>
+              </w:rPr>
+              <w:t xml:space="preserve">Day 5</w:t>
+            </w:r>
+          </w:p>
+        </w:tc>
+        <w:tc>
+          <w:tcPr>
+            <w:tcW w:type="dxa" w:w="7600"/>
+            <w:tcMar>
+              <w:top w:type="dxa" w:w="60"/>
+              <w:left w:type="dxa" w:w="120"/>
+              <w:bottom w:type="dxa" w:w="60"/>
+              <w:right w:type="dxa" w:w="120"/>
+            </w:tcMar>
+          </w:tcPr>
+          <w:p>
+            <w:r>
+              <w:rPr>
+                <w:b w:val="false"/>
+                <w:bCs w:val="false"/>
+                <w:sz w:val="20"/>
+                <w:szCs w:val="20"/>
+              </w:rPr>
+              <w:t xml:space="preserve">English  ·  Agency in Learning</w:t>
+            </w:r>
+          </w:p>
+        </w:tc>
+      </w:tr>
+      <w:tr>
+        <w:tc>
+          <w:tcPr>
+            <w:tcW w:type="dxa" w:w="3200"/>
+            <w:tcMar>
+              <w:top w:type="dxa" w:w="60"/>
+              <w:left w:type="dxa" w:w="120"/>
+              <w:bottom w:type="dxa" w:w="60"/>
+              <w:right w:type="dxa" w:w="120"/>
+            </w:tcMar>
+          </w:tcPr>
+          <w:p>
+            <w:r>
+              <w:rPr>
+                <w:b/>
+                <w:bCs/>
+                <w:color w:val="7A3B69"/>
+                <w:sz w:val="20"/>
+                <w:szCs w:val="20"/>
+              </w:rPr>
+              <w:t xml:space="preserve">Day 6</w:t>
+            </w:r>
+          </w:p>
+        </w:tc>
+        <w:tc>
+          <w:tcPr>
+            <w:tcW w:type="dxa" w:w="7600"/>
+            <w:tcMar>
+              <w:top w:type="dxa" w:w="60"/>
+              <w:left w:type="dxa" w:w="120"/>
+              <w:bottom w:type="dxa" w:w="60"/>
+              <w:right w:type="dxa" w:w="120"/>
+            </w:tcMar>
+          </w:tcPr>
+          <w:p>
+            <w:r>
+              <w:rPr>
+                <w:b w:val="false"/>
+                <w:bCs w:val="false"/>
+                <w:sz w:val="20"/>
+                <w:szCs w:val="20"/>
+              </w:rPr>
+              <w:t xml:space="preserve">Research Project  ·  a short small-group wellbeing check and reflection</w:t>
+            </w:r>
+          </w:p>
+        </w:tc>
+      </w:tr>
+    </w:tbl>
+    <w:p>
+      <w:pPr>
+        <w:spacing w:after="120" w:before="0"/>
+      </w:pPr>
+      <w:r>
+        <w:rPr>
+          <w:sz w:val="22"/>
+          <w:szCs w:val="22"/>
+        </w:rPr>
+        <w:t xml:space="preserve">This is one example — adapt it to your site. The fixed points are the weekly hours per component (3h in-person, 2h independent) and that the components run side by side; how you place them across the week is yours. Fewer learning days? Run longer sessions on fewer days. Early cohorts, before the Research Project’s shared challenge is agreed, run Agency in Learning and English only — about six hours in-person a week — and add the Research Project when it is ready.</w:t>
+      </w:r>
+    </w:p>
+    <w:p>
+      <w:pPr>
+        <w:pStyle w:val="Heading2"/>
+        <w:spacing w:after="80" w:before="200"/>
+      </w:pPr>
+      <w:r>
+        <w:rPr>
+          <w:b/>
+          <w:bCs/>
+          <w:color w:val="7A3B69"/>
+          <w:sz w:val="25"/>
+          <w:szCs w:val="25"/>
+        </w:rPr>
+        <w:t xml:space="preserve">The 12-week rhythm</w:t>
+      </w:r>
+    </w:p>
+    <w:p>
+      <w:pPr>
+        <w:spacing w:after="120" w:before="0"/>
+      </w:pPr>
+      <w:r>
+        <w:rPr>
+          <w:sz w:val="22"/>
+          <w:szCs w:val="22"/>
+        </w:rPr>
+        <w:t xml:space="preserve">Around that weekly learning, hold this assessment rhythm: five weeks of learning, a supported assessment, five more weeks, then the final assessment. Your job is to protect the two assessment windows and keep them on the calendar.</w:t>
       </w:r>
     </w:p>
     <w:tbl>

</xml_diff>